<commit_message>
Add author name, affiliation, email and ORCID
</commit_message>
<xml_diff>
--- a/paper/LinguaParity_ICAAD26_full_paper.docx
+++ b/paper/LinguaParity_ICAAD26_full_paper.docx
@@ -15,7 +15,7 @@
         <w:pStyle w:val="Yazarlar"/>
       </w:pPr>
       <w:r>
-        <w:t>Full Name Surname</w:t>
+        <w:t>Inayat Arshad</w:t>
       </w:r>
       <w:r>
         <w:rPr>
@@ -36,7 +36,7 @@
         <w:t>1</w:t>
       </w:r>
       <w:r>
-        <w:t>Department, Faculty, University, City, Country</w:t>
+        <w:t>Department of Computer and Information Sciences, Pakistan Institute of Engineering and Applied Sciences (PIEAS), Lehtrar Road, Nilore, Islamabad, Pakistan</w:t>
       </w:r>
     </w:p>
     <w:p>
@@ -45,7 +45,7 @@
         <w:spacing w:after="0"/>
       </w:pPr>
       <w:r>
-        <w:t>email@domain.com   |   ORCID: 0000-0000-0000-0000</w:t>
+        <w:t>bscs2248@pieas.edu.pk   |   ORCID: 0009-0006-3999-3144</w:t>
       </w:r>
     </w:p>
     <w:p>
@@ -181,11 +181,11 @@
         <w:t>Joshi et al. [5] grouped the world's languages into resource classes and showed that most languages have almost no labelled data; Blasi et al. [6] linked performance gaps to the economic and demographic weight of language communities. Multilingual evaluations of generative models such as MEGA [3] confirm large drops for low-resource languages. Open-domain resources such as XOR QA [13], MKQA [14] and MIRACL [15] evaluate cross-lingual retrieval and answering, and Chirkova et al. [11] showed that multilingual</w:t>
       </w:r>
       <w:r>
-        <w:t xml:space="preserve"> RAG pipelines need careful choice of retriever and prompt language. Sharma et al. [10] found that LLMs in RAG settings favour information in the query language and otherwise default to high-resource sources, describing the result as a "faux polyglot" behaviour. Work on Wikipedia has long shown that language editions differ in content, not only in size </w:t>
+        <w:t xml:space="preserve"> RAG pipelines need careful choice of retriever and prompt language. Sharma et al. [10] found that LLMs in RAG settings favour information in the query language and otherwise default to high-resource sources, describing the result as a "faux </w:t>
       </w:r>
       <w:r>
         <w:lastRenderedPageBreak/>
-        <w:t>[16]. LinguaParity builds on these strands but changes the unit of analysis from task accuracy to whether an equivalent information need can be served with e</w:t>
+        <w:t>polyglot" behaviour. Work on Wikipedia has long shown that language editions differ in content, not only in size [16]. LinguaParity builds on these strands but changes the unit of analysis from task accuracy to whether an equivalent information need can be served with e</w:t>
       </w:r>
       <w:r>
         <w:t>quivalent evidence.</w:t>
@@ -945,6 +945,7 @@
                 <w:b/>
                 <w:sz w:val="14"/>
               </w:rPr>
+              <w:lastRenderedPageBreak/>
               <w:t>Language</w:t>
             </w:r>
           </w:p>
@@ -1170,7 +1171,6 @@
               <w:rPr>
                 <w:sz w:val="14"/>
               </w:rPr>
-              <w:lastRenderedPageBreak/>
               <w:t>English</w:t>
             </w:r>
           </w:p>
@@ -2423,7 +2423,7 @@
           <w:noProof/>
         </w:rPr>
         <w:drawing>
-          <wp:inline distT="0" distB="0" distL="0" distR="0" wp14:anchorId="432E2C23" wp14:editId="5D6005CB">
+          <wp:inline distT="0" distB="0" distL="0" distR="0" wp14:anchorId="59794AB0" wp14:editId="1D3320F3">
             <wp:extent cx="5580000" cy="2568571"/>
             <wp:effectExtent l="0" t="0" r="0" b="0"/>
             <wp:docPr id="1" name="Picture 1"/>
@@ -2525,10 +2525,10 @@
         </w:rPr>
         <w:lastRenderedPageBreak/>
         <w:drawing>
-          <wp:inline distT="0" distB="0" distL="0" distR="0" wp14:anchorId="47CB16BC" wp14:editId="553409E8">
+          <wp:inline distT="0" distB="0" distL="0" distR="0" wp14:anchorId="4D83CA0A" wp14:editId="53EAD193">
             <wp:extent cx="5580000" cy="1682857"/>
             <wp:effectExtent l="0" t="0" r="0" b="0"/>
-            <wp:docPr id="42247846" name="Picture 42247846"/>
+            <wp:docPr id="1928922214" name="Picture 1928922214"/>
             <wp:cNvGraphicFramePr>
               <a:graphicFrameLocks xmlns:a="http://schemas.openxmlformats.org/drawingml/2006/main" noChangeAspect="1"/>
             </wp:cNvGraphicFramePr>

</xml_diff>

<commit_message>
Add the Spanish and Dutch findings to the paper and rebuild DOCX and PDF
</commit_message>
<xml_diff>
--- a/paper/LinguaParity_ICAAD26_full_paper.docx
+++ b/paper/LinguaParity_ICAAD26_full_paper.docx
@@ -78,10 +78,13 @@
         <w:t>Large language models (LLMs) are marketed as multilingual, yet multilingual capability does not guarantee that speakers of different languages receive equally reliable and complete information. This study introduces LinguaParity, a framework that treats multilingual AI as an information-access pipeline and measures parity at each stage: evidence availability, retrieval, evidence coverage, dependence on high-resource sources, and the token cost of expressing the same need. We built 32 parallel information ne</w:t>
       </w:r>
       <w:r>
-        <w:t>eds on education, employment, public services and digital safety, each with three verifiable key facts, and evaluated them in English, Turkish, Urdu, Swahili, Yoruba and Amharic against the live Wikipedia editions of those languages using a model-independent retrieval-augmented generation (RAG) retriever. The canonical article for a need existed in 30 of 32 cases for Turkish, 19 for Urdu, 8 for Swahili, 0 for Yoruba and 1 for Amharic. Native evidence covered 95% of key facts for English but 10% on average f</w:t>
+        <w:t>eds on education, employment, public services and digital safety, each with three verifiable key facts, and evaluated them in English, Spanish, Dutch, Turkish, Urdu, Swahili, Yoruba and Amharic against the live Wikipedia editions of those languages using a model-independent retrieval-augmented generation (RAG) retriever. The canonical article for a need existed in 30 of 32 cases for Spanish, 27 of 32 cases for Dutch, 30 of 32 cases for Turkish, 19 of 32 cases for Urdu, 8 of 32 cases for Swahili, 0 of 32 cas</w:t>
       </w:r>
       <w:r>
-        <w:t>or the three lowest-resource languages, while English-pivot evidence raised this to 57%. When native and English evidence competed, English passages filled 53% of top-ranked slots for these languages, and the same question cost up to 4.0 times more tokens than in English. Information inequality is therefore already present before any text is generated, and closing it through English sources trades local relevance for coverage.</w:t>
+        <w:t xml:space="preserve">es for Yoruba and 1 of 32 cases for Amharic. Native evidence covered 95% of key facts for English but 10% on average for the three lowest-resource languages, while English-pivot evidence raised this to 57%. When native and English evidence competed, English passages filled 53% of top-ranked slots for these languages, and the same question cost up to 4.0 times more tokens than in English. Information inequality is therefore already present before any text is generated, and closing it through English sources </w:t>
+      </w:r>
+      <w:r>
+        <w:t>trades local relevance for coverage.</w:t>
       </w:r>
     </w:p>
     <w:p>
@@ -151,10 +154,10 @@
         <w:spacing w:after="0"/>
       </w:pPr>
       <w:r>
-        <w:t>This paper introduces LinguaParity, a framework for measuring information-access parity across languages, and reports a controlled study of its evidence layer. The contributions are: (i) a stage-wise definition of parity covering evidence availability, retrieval, evidence coverage, source-language dependence and token cost; (ii) a parallel set of 32 socially relevant information needs with verifiable key facts; (iii) a measurement of six languages, from English to Amharic, against the live Wikipedia edition</w:t>
+        <w:t>This paper introduces LinguaParity, a framework for measuring information-access parity across languages, and reports a controlled study of its evidence layer. The contributions are: (i) a stage-wise definition of parity covering evidence availability, retrieval, evidence coverage, source-language dependence and token cost; (ii) a parallel set of 32 socially relevant information needs with verifiable key facts; (iii) a measurement of eight languages, from English to Amharic, against the live Wikipedia editi</w:t>
       </w:r>
       <w:r>
-        <w:t>s that many RAG systems use as a knowledge source; and (iv) an open, reproducible implementation. The central finding is that much of the inequality is already in place before an LLM writes a single word.</w:t>
+        <w:t>ons that many RAG systems use as a knowledge source; and (iv) an open, reproducible implementation. The central finding is that much of the inequality is already in place before an LLM writes a single word.</w:t>
       </w:r>
     </w:p>
     <w:p>
@@ -181,11 +184,11 @@
         <w:t>Joshi et al. [5] grouped the world's languages into resource classes and showed that most languages have almost no labelled data; Blasi et al. [6] linked performance gaps to the economic and demographic weight of language communities. Multilingual evaluations of generative models such as MEGA [3] confirm large drops for low-resource languages. Open-domain resources such as XOR QA [13], MKQA [14] and MIRACL [15] evaluate cross-lingual retrieval and answering, and Chirkova et al. [11] showed that multilingual</w:t>
       </w:r>
       <w:r>
-        <w:t xml:space="preserve"> RAG pipelines need careful choice of retriever and prompt language. Sharma et al. [10] found that LLMs in RAG settings favour information in the query language and otherwise default to high-resource sources, describing the result as a "faux </w:t>
+        <w:t xml:space="preserve"> RAG pipelines need careful choice of retriever and prompt language. Sharma et al. [10] found that LLMs in RAG settings favour </w:t>
       </w:r>
       <w:r>
         <w:lastRenderedPageBreak/>
-        <w:t>polyglot" behaviour. Work on Wikipedia has long shown that language editions differ in content, not only in size [16]. LinguaParity builds on these strands but changes the unit of analysis from task accuracy to whether an equivalent information need can be served with e</w:t>
+        <w:t>information in the query language and otherwise default to high-resource sources, describing the result as a "faux polyglot" behaviour. Work on Wikipedia has long shown that language editions differ in content, not only in size [16]. LinguaParity builds on these strands but changes the unit of analysis from task accuracy to whether an equivalent information need can be served with e</w:t>
       </w:r>
       <w:r>
         <w:t>quivalent evidence.</w:t>
@@ -239,10 +242,10 @@
         <w:spacing w:after="0"/>
       </w:pPr>
       <w:r>
-        <w:t>Six languages span the resource classes of Joshi et al. [5]: English (class 5), Turkish (4), Urdu (3), and Swahili, Yoruba and Amharic (2). They cover Latin, Perso-Arabic and Ethiopic scripts. Questions were translated from English with NLLB-200 (distilled, 600M parameters) [17]. As a quality check, LaBSE [18] similarity between each English question and its translation averaged between 0.78 and 0.90, and between 0.81 and 0.96 after back-translation (Table 1). Machine-translated questions are a limitation t</w:t>
+        <w:t>Eight languages span the resource classes of Joshi et al. [5] (class in brackets): English and Spanish (5), Dutch and Turkish (4), Urdu (3) and Swahili, Yoruba and Amharic (2). Spanish and Dutch serve as high-resource European reference points. The languages cover Latin, Perso-Arabic and Ethiopic scripts. Questions were translated from English with NLLB-200 (distilled, 600M parameters) [17]. As a quality check, LaBSE [18] similarity between each English question and its translation averaged between 0.78 and</w:t>
       </w:r>
       <w:r>
-        <w:t>hat native-speaker review should remove in future versions.</w:t>
+        <w:t xml:space="preserve"> 0.93, and between 0.81 and 0.99 after back-translation (Table 1). Machine-translated questions are a limitation that native-speaker review should remove in future versions.</w:t>
       </w:r>
     </w:p>
     <w:p>
@@ -833,7 +836,7 @@
         <w:spacing w:after="0"/>
       </w:pPr>
       <w:r>
-        <w:t>Paired differences across the 32 needs were tested with the Wilcoxon signed-rank test and Holm correction over the five non-English languages; 95% confidence intervals are percentile bootstraps over needs (5,000 resamples). All Wikipedia responses were cached, so every number in this paper can be recomputed from the released snapshot. Everything ran on a CPU-only laptop. The code and data are available at github.com/inayatarshad/linguaparity.</w:t>
+        <w:t>Paired differences across the 32 needs were tested with the Wilcoxon signed-rank test and Holm correction over the seven non-English languages; 95% confidence intervals are percentile bootstraps over needs (5,000 resamples). All Wikipedia responses were cached, so every number in this paper can be recomputed from the released snapshot. Everything ran on a CPU-only laptop. The code and data are available at github.com/inayatarshad/linguaparity.</w:t>
       </w:r>
     </w:p>
     <w:p>
@@ -873,10 +876,10 @@
         <w:spacing w:after="0"/>
       </w:pPr>
       <w:r>
-        <w:t>Table 1 summarises the pipeline for each language. Availability falls steeply with resource level: the canonical article existed for all 32 needs in English, 30 in Turkish, 19 in Urdu, 8 in Swahili, 0 in Yoruba and 1 in Amharic. Where articles existed they were much shorter than their English counterparts (mean size ratio 0.14 for Turkish and 0.03 for Urdu, counting missing articles as zero). Raw edition size is a poor proxy for availability: Urdu Wikipedia has about as many articles as Turkish (704,932 aga</w:t>
+        <w:t>Table 1 summarises the pipeline for each language. Availability falls steeply with resource level: the canonical article existed for all 32 needs in English, 30 in Spanish, 27 in Dutch, 30 in Turkish, 19 in Urdu, 8 in Swahili, 0 in Yoruba and 1 in Amharic. Where articles existed they were much shorter than their English counterparts (mean size ratio 0.14 for Turkish and 0.03 for Urdu, counting missing articles as zero). Raw edition size is a poor proxy for availability: Urdu Wikipedia has about as many arti</w:t>
       </w:r>
       <w:r>
-        <w:t>inst 702,205) yet covers far fewer of these needs, which suggests that many of its pages do not address everyday social topics. Retrieval tracks availability: the canonical article reached the native top 3 for 97% of English needs, 47% of Turkish, 38% of Urdu and 9% of Swahili needs.</w:t>
+        <w:t>cles as Turkish (704,932 against 702,205) yet covers far fewer of these needs, which suggests that many of its pages do not address everyday social topics. Retrieval tracks availability: the canonical article reached the native top 3 for 97% of English, 72% of Spanish, 59% of Dutch, 47% of Turkish, 38% of Urdu, 9% of Swahili, 0% of Yoruba and 3% of Amharic needs.</w:t>
       </w:r>
     </w:p>
     <w:p>
@@ -889,6 +892,7 @@
           <w:b/>
           <w:bCs w:val="0"/>
         </w:rPr>
+        <w:lastRenderedPageBreak/>
         <w:t xml:space="preserve">Table 1. </w:t>
       </w:r>
       <w:r>
@@ -945,7 +949,6 @@
                 <w:b/>
                 <w:sz w:val="14"/>
               </w:rPr>
-              <w:lastRenderedPageBreak/>
               <w:t>Language</w:t>
             </w:r>
           </w:p>
@@ -1352,6 +1355,416 @@
                 <w:sz w:val="14"/>
               </w:rPr>
               <w:t>1.00</w:t>
+            </w:r>
+          </w:p>
+        </w:tc>
+      </w:tr>
+      <w:tr>
+        <w:trPr>
+          <w:cantSplit/>
+          <w:trHeight w:val="227"/>
+          <w:jc w:val="center"/>
+        </w:trPr>
+        <w:tc>
+          <w:tcPr>
+            <w:tcW w:w="963" w:type="dxa"/>
+            <w:vAlign w:val="center"/>
+          </w:tcPr>
+          <w:p>
+            <w:pPr>
+              <w:spacing w:after="0"/>
+              <w:jc w:val="left"/>
+            </w:pPr>
+            <w:r>
+              <w:rPr>
+                <w:sz w:val="14"/>
+              </w:rPr>
+              <w:t>Spanish</w:t>
+            </w:r>
+          </w:p>
+        </w:tc>
+        <w:tc>
+          <w:tcPr>
+            <w:tcW w:w="567" w:type="dxa"/>
+            <w:vAlign w:val="center"/>
+          </w:tcPr>
+          <w:p>
+            <w:pPr>
+              <w:spacing w:after="0"/>
+              <w:jc w:val="center"/>
+            </w:pPr>
+            <w:r>
+              <w:rPr>
+                <w:sz w:val="14"/>
+              </w:rPr>
+              <w:t>5</w:t>
+            </w:r>
+          </w:p>
+        </w:tc>
+        <w:tc>
+          <w:tcPr>
+            <w:tcW w:w="963" w:type="dxa"/>
+            <w:vAlign w:val="center"/>
+          </w:tcPr>
+          <w:p>
+            <w:pPr>
+              <w:spacing w:after="0"/>
+              <w:jc w:val="center"/>
+            </w:pPr>
+            <w:r>
+              <w:rPr>
+                <w:sz w:val="14"/>
+              </w:rPr>
+              <w:t>2,142,571</w:t>
+            </w:r>
+          </w:p>
+        </w:tc>
+        <w:tc>
+          <w:tcPr>
+            <w:tcW w:w="793" w:type="dxa"/>
+            <w:vAlign w:val="center"/>
+          </w:tcPr>
+          <w:p>
+            <w:pPr>
+              <w:spacing w:after="0"/>
+              <w:jc w:val="center"/>
+            </w:pPr>
+            <w:r>
+              <w:rPr>
+                <w:sz w:val="14"/>
+              </w:rPr>
+              <w:t>0.94</w:t>
+            </w:r>
+          </w:p>
+        </w:tc>
+        <w:tc>
+          <w:tcPr>
+            <w:tcW w:w="680" w:type="dxa"/>
+            <w:vAlign w:val="center"/>
+          </w:tcPr>
+          <w:p>
+            <w:pPr>
+              <w:spacing w:after="0"/>
+              <w:jc w:val="center"/>
+            </w:pPr>
+            <w:r>
+              <w:rPr>
+                <w:sz w:val="14"/>
+              </w:rPr>
+              <w:t>0.72</w:t>
+            </w:r>
+          </w:p>
+        </w:tc>
+        <w:tc>
+          <w:tcPr>
+            <w:tcW w:w="793" w:type="dxa"/>
+            <w:vAlign w:val="center"/>
+          </w:tcPr>
+          <w:p>
+            <w:pPr>
+              <w:spacing w:after="0"/>
+              <w:jc w:val="center"/>
+            </w:pPr>
+            <w:r>
+              <w:rPr>
+                <w:sz w:val="14"/>
+              </w:rPr>
+              <w:t>0.93</w:t>
+            </w:r>
+          </w:p>
+        </w:tc>
+        <w:tc>
+          <w:tcPr>
+            <w:tcW w:w="793" w:type="dxa"/>
+            <w:vAlign w:val="center"/>
+          </w:tcPr>
+          <w:p>
+            <w:pPr>
+              <w:spacing w:after="0"/>
+              <w:jc w:val="center"/>
+            </w:pPr>
+            <w:r>
+              <w:rPr>
+                <w:sz w:val="14"/>
+              </w:rPr>
+              <w:t>0.61</w:t>
+            </w:r>
+          </w:p>
+        </w:tc>
+        <w:tc>
+          <w:tcPr>
+            <w:tcW w:w="793" w:type="dxa"/>
+            <w:vAlign w:val="center"/>
+          </w:tcPr>
+          <w:p>
+            <w:pPr>
+              <w:spacing w:after="0"/>
+              <w:jc w:val="center"/>
+            </w:pPr>
+            <w:r>
+              <w:rPr>
+                <w:sz w:val="14"/>
+              </w:rPr>
+              <w:t>0.95</w:t>
+            </w:r>
+          </w:p>
+        </w:tc>
+        <w:tc>
+          <w:tcPr>
+            <w:tcW w:w="793" w:type="dxa"/>
+            <w:vAlign w:val="center"/>
+          </w:tcPr>
+          <w:p>
+            <w:pPr>
+              <w:spacing w:after="0"/>
+              <w:jc w:val="center"/>
+            </w:pPr>
+            <w:r>
+              <w:rPr>
+                <w:sz w:val="14"/>
+              </w:rPr>
+              <w:t>0.77</w:t>
+            </w:r>
+          </w:p>
+        </w:tc>
+        <w:tc>
+          <w:tcPr>
+            <w:tcW w:w="737" w:type="dxa"/>
+            <w:vAlign w:val="center"/>
+          </w:tcPr>
+          <w:p>
+            <w:pPr>
+              <w:spacing w:after="0"/>
+              <w:jc w:val="center"/>
+            </w:pPr>
+            <w:r>
+              <w:rPr>
+                <w:sz w:val="14"/>
+              </w:rPr>
+              <w:t>0.20</w:t>
+            </w:r>
+          </w:p>
+        </w:tc>
+        <w:tc>
+          <w:tcPr>
+            <w:tcW w:w="623" w:type="dxa"/>
+            <w:vAlign w:val="center"/>
+          </w:tcPr>
+          <w:p>
+            <w:pPr>
+              <w:spacing w:after="0"/>
+              <w:jc w:val="center"/>
+            </w:pPr>
+            <w:r>
+              <w:rPr>
+                <w:sz w:val="14"/>
+              </w:rPr>
+              <w:t>1.49</w:t>
+            </w:r>
+          </w:p>
+        </w:tc>
+      </w:tr>
+      <w:tr>
+        <w:trPr>
+          <w:cantSplit/>
+          <w:trHeight w:val="227"/>
+          <w:jc w:val="center"/>
+        </w:trPr>
+        <w:tc>
+          <w:tcPr>
+            <w:tcW w:w="963" w:type="dxa"/>
+            <w:vAlign w:val="center"/>
+          </w:tcPr>
+          <w:p>
+            <w:pPr>
+              <w:spacing w:after="0"/>
+              <w:jc w:val="left"/>
+            </w:pPr>
+            <w:r>
+              <w:rPr>
+                <w:sz w:val="14"/>
+              </w:rPr>
+              <w:t>Dutch</w:t>
+            </w:r>
+          </w:p>
+        </w:tc>
+        <w:tc>
+          <w:tcPr>
+            <w:tcW w:w="567" w:type="dxa"/>
+            <w:vAlign w:val="center"/>
+          </w:tcPr>
+          <w:p>
+            <w:pPr>
+              <w:spacing w:after="0"/>
+              <w:jc w:val="center"/>
+            </w:pPr>
+            <w:r>
+              <w:rPr>
+                <w:sz w:val="14"/>
+              </w:rPr>
+              <w:t>4</w:t>
+            </w:r>
+          </w:p>
+        </w:tc>
+        <w:tc>
+          <w:tcPr>
+            <w:tcW w:w="963" w:type="dxa"/>
+            <w:vAlign w:val="center"/>
+          </w:tcPr>
+          <w:p>
+            <w:pPr>
+              <w:spacing w:after="0"/>
+              <w:jc w:val="center"/>
+            </w:pPr>
+            <w:r>
+              <w:rPr>
+                <w:sz w:val="14"/>
+              </w:rPr>
+              <w:t>2,229,079</w:t>
+            </w:r>
+          </w:p>
+        </w:tc>
+        <w:tc>
+          <w:tcPr>
+            <w:tcW w:w="793" w:type="dxa"/>
+            <w:vAlign w:val="center"/>
+          </w:tcPr>
+          <w:p>
+            <w:pPr>
+              <w:spacing w:after="0"/>
+              <w:jc w:val="center"/>
+            </w:pPr>
+            <w:r>
+              <w:rPr>
+                <w:sz w:val="14"/>
+              </w:rPr>
+              <w:t>0.84</w:t>
+            </w:r>
+          </w:p>
+        </w:tc>
+        <w:tc>
+          <w:tcPr>
+            <w:tcW w:w="680" w:type="dxa"/>
+            <w:vAlign w:val="center"/>
+          </w:tcPr>
+          <w:p>
+            <w:pPr>
+              <w:spacing w:after="0"/>
+              <w:jc w:val="center"/>
+            </w:pPr>
+            <w:r>
+              <w:rPr>
+                <w:sz w:val="14"/>
+              </w:rPr>
+              <w:t>0.59</w:t>
+            </w:r>
+          </w:p>
+        </w:tc>
+        <w:tc>
+          <w:tcPr>
+            <w:tcW w:w="793" w:type="dxa"/>
+            <w:vAlign w:val="center"/>
+          </w:tcPr>
+          <w:p>
+            <w:pPr>
+              <w:spacing w:after="0"/>
+              <w:jc w:val="center"/>
+            </w:pPr>
+            <w:r>
+              <w:rPr>
+                <w:sz w:val="14"/>
+              </w:rPr>
+              <w:t>0.91</w:t>
+            </w:r>
+          </w:p>
+        </w:tc>
+        <w:tc>
+          <w:tcPr>
+            <w:tcW w:w="793" w:type="dxa"/>
+            <w:vAlign w:val="center"/>
+          </w:tcPr>
+          <w:p>
+            <w:pPr>
+              <w:spacing w:after="0"/>
+              <w:jc w:val="center"/>
+            </w:pPr>
+            <w:r>
+              <w:rPr>
+                <w:sz w:val="14"/>
+              </w:rPr>
+              <w:t>0.61</w:t>
+            </w:r>
+          </w:p>
+        </w:tc>
+        <w:tc>
+          <w:tcPr>
+            <w:tcW w:w="793" w:type="dxa"/>
+            <w:vAlign w:val="center"/>
+          </w:tcPr>
+          <w:p>
+            <w:pPr>
+              <w:spacing w:after="0"/>
+              <w:jc w:val="center"/>
+            </w:pPr>
+            <w:r>
+              <w:rPr>
+                <w:sz w:val="14"/>
+              </w:rPr>
+              <w:t>0.84</w:t>
+            </w:r>
+          </w:p>
+        </w:tc>
+        <w:tc>
+          <w:tcPr>
+            <w:tcW w:w="793" w:type="dxa"/>
+            <w:vAlign w:val="center"/>
+          </w:tcPr>
+          <w:p>
+            <w:pPr>
+              <w:spacing w:after="0"/>
+              <w:jc w:val="center"/>
+            </w:pPr>
+            <w:r>
+              <w:rPr>
+                <w:sz w:val="14"/>
+              </w:rPr>
+              <w:t>0.86</w:t>
+            </w:r>
+          </w:p>
+        </w:tc>
+        <w:tc>
+          <w:tcPr>
+            <w:tcW w:w="737" w:type="dxa"/>
+            <w:vAlign w:val="center"/>
+          </w:tcPr>
+          <w:p>
+            <w:pPr>
+              <w:spacing w:after="0"/>
+              <w:jc w:val="center"/>
+            </w:pPr>
+            <w:r>
+              <w:rPr>
+                <w:sz w:val="14"/>
+              </w:rPr>
+              <w:t>0.25</w:t>
+            </w:r>
+          </w:p>
+        </w:tc>
+        <w:tc>
+          <w:tcPr>
+            <w:tcW w:w="623" w:type="dxa"/>
+            <w:vAlign w:val="center"/>
+          </w:tcPr>
+          <w:p>
+            <w:pPr>
+              <w:spacing w:after="0"/>
+              <w:jc w:val="center"/>
+            </w:pPr>
+            <w:r>
+              <w:rPr>
+                <w:sz w:val="14"/>
+              </w:rPr>
+              <w:t>1.50</w:t>
             </w:r>
           </w:p>
         </w:tc>
@@ -2409,7 +2822,15 @@
         <w:spacing w:after="0"/>
       </w:pPr>
       <w:r>
-        <w:t>Figure 1 follows each language through the pipeline. Native evidence covered 95% of key facts in English, compared with 54% in Turkish, 50% in Urdu, 21% in Swahili, 5% in Yoruba, 5% in Amharic. The gap to English was significant for Turkish, Urdu, Swahili, Yoruba, Amharic (Wilcoxon, Holm-corrected p &lt; 0.05). At the level of individual needs, whether a native article existed was associated with native coverage (Spearman ρ = 0.58, p &lt; 0.001, n = 160).</w:t>
+        <w:t>Figure 1 follows each language through the pipeline. Native evidence covered 95% of key facts in English, compared with 61% in Spanish, 61% in Dutch, 54% in Turkish, 50% in Urdu, 21% in Swahili, 5% in Yoruba, 5% in Amharic. The gap to English was significant for Spanish, Dutch, Turkish, Urdu, Swahili, Yoruba, Amharic (Wilcoxon, Holm-corrected p &lt; 0.05). At the level of individual needs, whether a native article existed was associated with native coverage (Spearman ρ = 0.64, p &lt; 0.001, n = 224).</w:t>
+      </w:r>
+    </w:p>
+    <w:p>
+      <w:pPr>
+        <w:spacing w:after="0"/>
+      </w:pPr>
+      <w:r>
+        <w:t>The gap is not confined to low-resource languages. Spanish (2,142,571 articles) and Dutch (2,229,079 articles) have some of the largest Wikipedias after English, yet native evidence covered only 61% of key facts in Spanish and 61% of key facts in Dutch, against 95% in English. Information access is English-centric even among well-resourced languages, and low-resource languages sit at the far end of the same gradient.</w:t>
       </w:r>
     </w:p>
     <w:p>
@@ -2423,7 +2844,7 @@
           <w:noProof/>
         </w:rPr>
         <w:drawing>
-          <wp:inline distT="0" distB="0" distL="0" distR="0" wp14:anchorId="59794AB0" wp14:editId="1D3320F3">
+          <wp:inline distT="0" distB="0" distL="0" distR="0" wp14:anchorId="0F47CD9A" wp14:editId="50A75972">
             <wp:extent cx="5580000" cy="2568571"/>
             <wp:effectExtent l="0" t="0" r="0" b="0"/>
             <wp:docPr id="1" name="Picture 1"/>
@@ -2480,10 +2901,13 @@
         <w:spacing w:after="0"/>
       </w:pPr>
       <w:r>
-        <w:t>Routing the question through English closes much of this gap. English-pivot evidence covered 78% for Turkish, 83% for Urdu, 69% for Swahili, 38% for Yoruba, 66% for Amharic; the gain over native evidence averaged 47% for the three lowest-resource languages. When native and English candidates were ranked together, English passages took 18% of slots for Turkish, 16% of slots for Urdu, 45% of slots for Swahili, 60% of slots for Yoruba, 54% of slots for Amharic. In other words, a multilingual RAG system that se</w:t>
+        <w:t>Routing the question through English closes much of this gap. English-pivot evidence covered 95% for Spanish, 84% for Dutch, 78% for Turkish, 83% for Urdu, 69% for Swahili, 38% for Yoruba, 66% for Amharic; the gain over native evidence averaged 47% for the three lowest-resource languages. When native and English candidates were ranked together, English passages took 20% of slots for Spanish, 25% of slots for Dutch, 18% of slots for Turkish, 16% of slots for Urdu, 45% of slots for Swahili, 60% of slots for Y</w:t>
       </w:r>
       <w:r>
-        <w:t>rves these users well does so by quietly answering from English sources. This agrees with the high-resource fallback reported by Sharma et al. [10], and it carries a cost that coverage scores do not capture: English Wikipedia describes passports, pensions or unemployment benefits mainly from the perspective of high-income countries, so the answer can be complete but locally irrelevant. The pivot also depends on machine translation of the question, which is itself weakest for the same languages (Table 1).</w:t>
+        <w:t>oruba, 54% of slots for Amharic. In other words, a multilingual RAG system that serves these users well does so by quietly answering from English sources. This agrees with the high-resource fallback reported by Sharma et al. [10], and it carries a cost that coverage scores do not capture: English Wikipedia describes passports, pensions or unemployment benefits mainly from the perspective of high-income countries, so the answer can be complete but locally irrelevant. The pivot also depends on machine transla</w:t>
+      </w:r>
+      <w:r>
+        <w:t>tion of the question, which is itself weakest for the same languages (Table 1).</w:t>
       </w:r>
     </w:p>
     <w:p>
@@ -2507,10 +2931,14 @@
         <w:spacing w:after="0"/>
       </w:pPr>
       <w:r>
-        <w:t>Figure 2 breaks native coverage down by domain. Public services were the best covered domain in Urdu, Swahili, Yoruba and Amharic, while digital safety and employment were the weakest: for the three lowest-resource languages, native evidence covered on average 6% of digital-safety facts and 4% of employment facts. These are the domains where new internet users most need timely, local guidance on scams, labour rights and benefits. Expressing the same question also cost more: relative to English, the tokenize</w:t>
+        <w:t xml:space="preserve">Figure 2 breaks native coverage down by domain. Public services were the best covered domain in Urdu, Swahili, Yoruba and Amharic, while digital safety and employment were the weakest: for the three lowest-resource languages, native evidence covered on average 6% of digital-safety facts and 4% of employment facts. These are the domains where new internet users most need timely, local guidance on scams, labour rights and </w:t>
       </w:r>
       <w:r>
-        <w:t>r shared by Qwen2.5 and Qwen3 needed 1.5x as many tokens for Turkish, 3.1x as many tokens for Urdu, 2.0x as many tokens for Swahili, 3.2x as many tokens for Yoruba, 4.0x as many tokens for Amharic. Longer token sequences mean higher cost per query, less room for evidence within a fixed context window and slower responses, which compounds the evidence gap [7, 8].</w:t>
+        <w:lastRenderedPageBreak/>
+        <w:t>benefits. Expressing the same question also cost more: relative to English, the tokenizer shared by Qwen2.5 and Qwen3 needed 1.5x as many tokens for Spanish, 1.5x as many tokens for Dutch, 1.5x as many tokens for Turkish, 3.1x as many tokens for Urdu, 2.0x as many tokens for Swahili, 3.2x as many tokens for Yoruba, 4.0x as many tokens for Amharic. Longer token sequences mean higher cost per query, less room for evidence within a fixed context window and slower responses, which compounds the evidence gap [7,</w:t>
+      </w:r>
+      <w:r>
+        <w:t xml:space="preserve"> 8].</w:t>
       </w:r>
     </w:p>
     <w:p>
@@ -2523,12 +2951,11 @@
         <w:rPr>
           <w:noProof/>
         </w:rPr>
-        <w:lastRenderedPageBreak/>
         <w:drawing>
-          <wp:inline distT="0" distB="0" distL="0" distR="0" wp14:anchorId="4D83CA0A" wp14:editId="53EAD193">
+          <wp:inline distT="0" distB="0" distL="0" distR="0" wp14:anchorId="3F1F55B6" wp14:editId="30280527">
             <wp:extent cx="5580000" cy="1682857"/>
             <wp:effectExtent l="0" t="0" r="0" b="0"/>
-            <wp:docPr id="1928922214" name="Picture 1928922214"/>
+            <wp:docPr id="1382759568" name="Picture 1382759568"/>
             <wp:cNvGraphicFramePr>
               <a:graphicFrameLocks xmlns:a="http://schemas.openxmlformats.org/drawingml/2006/main" noChangeAspect="1"/>
             </wp:cNvGraphicFramePr>
@@ -2601,7 +3028,7 @@
         <w:t>This study measures the evidence layer of the pipeline; the generation layer of the LinguaParity framework (answer completeness, factual consistency, citation quality and hallucination) is specified but not yet reported, because running LLMs on CPU was beyond the compute available for this version. The evidence results nonetheless bound what any RAG-based answer can contain. Questions were machine translated, Wikipedia is only one possible knowledge source, the needs are general rather than country specific</w:t>
       </w:r>
       <w:r>
-        <w:t>, and LaBSE similarity is a proxy for factual entailment whose reliability is itself likely to be lower for low-resource languages. The study covers six languages and 32 needs, so language-level correlations are indicative only.</w:t>
+        <w:t>, and LaBSE similarity is a proxy for factual entailment whose reliability is itself likely to be lower for low-resource languages. The study covers eight languages and 32 needs, so language-level correlations are indicative only.</w:t>
       </w:r>
     </w:p>
     <w:p>
@@ -2625,10 +3052,13 @@
         <w:spacing w:after="0"/>
       </w:pPr>
       <w:r>
-        <w:t>LinguaParity reframes multilingual AI evaluation as a question of information access. Across six languages and 32 socially relevant needs, the evidence that a retrieval-augmented assistant could draw on shrank sharply with resource level, from full availability in English to almost none in Yoruba and Amharic, and retrieval and coverage followed. English sources closed much of the gap, but only by making low-resource users dependent on content written for other contexts, while tokenization made each of their</w:t>
+        <w:t>LinguaParity reframes multilingual AI evaluation as a question of information access. Across eight languages and 32 socially relevant needs, the evidence that a retrieval-augmented assistant could draw on shrank sharply with resource level, from full availability in English to almost none in Yoruba and Amharic, and retrieval and coverage followed. Even high-resource European languages fell well short of English. English sources closed much of the gap, but only by making low-resource users dependent on conte</w:t>
       </w:r>
       <w:r>
-        <w:t xml:space="preserve"> questions more expensive. Because these disparities arise before generation, improving the language skills of LLMs alone will not equalise access. Investment in local-language content on public services, employment, education and online safety, in multilingual retrieval, and in evaluation of locally relevant answers is needed. Future work will add the generation-stage measurements with several open and commercial LLMs, native-speaker validation of the needs and country-specific information needs.</w:t>
+        <w:t>nt written for other contexts, while tokenization made each of their questions more expensive. Because these disparities arise before generation, improving the language skills of LLMs alone will not equalise access. Investment in local-language content on public services, employment, education and online safety, in multilingual retrieval, and in evaluation of locally relevant answers is needed. Future work will add the generation-stage measurements with several open and commercial LLMs, native-speaker valid</w:t>
+      </w:r>
+      <w:r>
+        <w:t>ation of the needs and country-specific information needs.</w:t>
       </w:r>
     </w:p>
     <w:p>
@@ -2818,6 +3248,7 @@
         <w:ind w:left="357" w:hanging="357"/>
       </w:pPr>
       <w:r>
+        <w:lastRenderedPageBreak/>
         <w:t>P. Lewis et al., "Retrieval-augmented generation for knowledge-intensive NLP tasks," in Advances Neural Inf. Process. Syst., vol. 33, 2020, pp. 9459-9474.</w:t>
       </w:r>
     </w:p>
@@ -2846,7 +3277,6 @@
         <w:ind w:left="357" w:hanging="357"/>
       </w:pPr>
       <w:r>
-        <w:lastRenderedPageBreak/>
         <w:t>N. Chirkova, D. Rau, H. Déjean, T. Formal, S. Clinchant, and V. Nikoulina, "Retrieval-augmented generation in multilingual settings," in Proc. 1st Workshop Towards Knowledgeable Language Models, Bangkok, Thailand, 2024, pp. 177-188.</w:t>
       </w:r>
     </w:p>

</xml_diff>